<commit_message>
Planilla SENCE: AE con ascenso Bloom identificar-describir-explicar-distinguir-analizar
Co-Authored-By: Claude Opus 5.5 <noreply@anthropic.com>
Claude-Session: https://claude.ai/code/session_01YUXpBk1ah7fEtFeWJYkMKL
</commit_message>
<xml_diff>
--- a/sence/Legislacion_Laboral_Planilla_SENCE_reingreso.docx
+++ b/sence/Legislacion_Laboral_Planilla_SENCE_reingreso.docx
@@ -159,7 +159,7 @@
               <w:rPr>
                 <w:sz w:val="19"/>
               </w:rPr>
-              <w:t>Los cinco AE quedan en el nivel Análisis de Bloom, en orden de complejidad creciente (Examinar → Comparar → Diferenciar → Distinguir → Analizar). Cada uno analiza una etapa de la relación laboral con el mismo objeto y contexto de la competencia, y el último usa el verbo de la competencia. Los productos de módulo son análisis evaluados con rúbrica.</w:t>
+              <w:t>Se mantiene el ascenso de Bloom hasta el verbo de la competencia: Identificar (conocimiento) → Describir y Explicar (comprensión) → Distinguir y Analizar (análisis). Cada AE ahora declara el mismo contexto laboral de la competencia (la gestión de personas) y una etapa del ciclo laboral. Cada producto de módulo aporta criterios que se integran en la auditoría final del caso integrador, que evidencia el análisis completo.</w:t>
             </w:r>
           </w:p>
         </w:tc>
@@ -422,7 +422,7 @@
               <w:rPr>
                 <w:sz w:val="19"/>
               </w:rPr>
-              <w:t>Examinar fundamentos normativos de la relación laboral en la gestión administrativa de personas según el Código del Trabajo</w:t>
+              <w:t>Identificar fundamentos normativos de la relación laboral en la gestión administrativa de personas según el Código del Trabajo</w:t>
             </w:r>
           </w:p>
         </w:tc>
@@ -536,7 +536,7 @@
               <w:rPr>
                 <w:sz w:val="19"/>
               </w:rPr>
-              <w:t>Comparar condiciones del contrato individual de trabajo en la gestión de contratación según el Código del Trabajo</w:t>
+              <w:t>Describir condiciones del contrato individual de trabajo en la gestión de contratación según el Código del Trabajo</w:t>
             </w:r>
           </w:p>
         </w:tc>
@@ -682,7 +682,7 @@
               <w:rPr>
                 <w:sz w:val="19"/>
               </w:rPr>
-              <w:t>Diferenciar derechos laborales en la tramitación de solicitudes del personal según el Código del Trabajo</w:t>
+              <w:t>Explicar derechos laborales en la tramitación de solicitudes del personal según el Código del Trabajo</w:t>
             </w:r>
           </w:p>
         </w:tc>
@@ -1837,7 +1837,7 @@
         <w:rPr>
           <w:b w:val="0"/>
         </w:rPr>
-        <w:t>AE1 – 9 h (Examinar fundamentos normativos de la relación laboral en la gestión administrativa de personas según el Código del Trabajo): examina principios, fuentes, organismos fiscalizadores y obligaciones de las partes; elabora un diagnóstico de riesgos de una situación laboral.</w:t>
+        <w:t>AE1 – 9 h (Identificar fundamentos normativos de la relación laboral en la gestión administrativa de personas según el Código del Trabajo): identifica principios, fuentes, organismos fiscalizadores y obligaciones de las partes; elabora un diagnóstico de riesgos de una situación laboral.</w:t>
       </w:r>
     </w:p>
     <w:p>
@@ -1845,7 +1845,7 @@
         <w:rPr>
           <w:b w:val="0"/>
         </w:rPr>
-        <w:t>AE2 – 11 h (Comparar condiciones del contrato individual de trabajo en la gestión de contratación según el Código del Trabajo): compara tipos de contrato, cláusulas, jornada, horas extraordinarias, registro de asistencia y remuneraciones en documentos simulados; revisa una situación contractual y de jornada.</w:t>
+        <w:t>AE2 – 11 h (Describir condiciones del contrato individual de trabajo en la gestión de contratación según el Código del Trabajo): describe tipos de contrato, cláusulas, jornada, horas extraordinarias, registro de asistencia y remuneraciones en documentos simulados; revisa una situación contractual y de jornada.</w:t>
       </w:r>
     </w:p>
     <w:p>
@@ -1853,7 +1853,7 @@
         <w:rPr>
           <w:b w:val="0"/>
         </w:rPr>
-        <w:t>AE3 – 12 h (Diferenciar derechos laborales en la tramitación de solicitudes del personal según el Código del Trabajo): diferencia derechos fundamentales, protección familiar, conciliación, feriado, permisos e inclusión en escenarios ramificados; resuelve con fundamentación una solicitud laboral.</w:t>
+        <w:t>AE3 – 12 h (Explicar derechos laborales en la tramitación de solicitudes del personal según el Código del Trabajo): explica derechos fundamentales, protección familiar, conciliación, feriado, permisos e inclusión en escenarios ramificados; resuelve con fundamentación una solicitud laboral.</w:t>
       </w:r>
     </w:p>
     <w:p>
@@ -1877,7 +1877,7 @@
         <w:rPr>
           <w:b w:val="0"/>
         </w:rPr>
-        <w:t>Cada AE analiza una etapa de la relación laboral; el conjunto de productos evidencia la competencia.</w:t>
+        <w:t>La secuencia asciende de conocimiento (AE1) a comprensión (AE2 y AE3) y análisis (AE4 y AE5); cada AE aborda una etapa de la relación laboral en el mismo contexto de gestión de personas y aporta los criterios que se integran en la auditoría final, que evidencia la competencia.</w:t>
       </w:r>
     </w:p>
     <w:p>
@@ -2314,7 +2314,7 @@
         <w:rPr>
           <w:b w:val="0"/>
         </w:rPr>
-        <w:t>AE1: Examina fundamentos normativos de la relación laboral en la gestión administrativa de personas según el Código del Trabajo.</w:t>
+        <w:t>AE1: Identifica fundamentos normativos de la relación laboral en la gestión administrativa de personas según el Código del Trabajo.</w:t>
       </w:r>
     </w:p>
     <w:p>
@@ -2322,7 +2322,7 @@
         <w:rPr>
           <w:b w:val="0"/>
         </w:rPr>
-        <w:t>AE2: Compara condiciones del contrato individual de trabajo en la gestión de contratación según el Código del Trabajo.</w:t>
+        <w:t>AE2: Describe condiciones del contrato individual de trabajo en la gestión de contratación según el Código del Trabajo.</w:t>
       </w:r>
     </w:p>
     <w:p>
@@ -2330,7 +2330,7 @@
         <w:rPr>
           <w:b w:val="0"/>
         </w:rPr>
-        <w:t>AE3: Diferencia derechos laborales en la tramitación de solicitudes del personal según el Código del Trabajo.</w:t>
+        <w:t>AE3: Explica derechos laborales en la tramitación de solicitudes del personal según el Código del Trabajo.</w:t>
       </w:r>
     </w:p>
     <w:p>
@@ -2370,7 +2370,7 @@
         <w:rPr>
           <w:b w:val="0"/>
         </w:rPr>
-        <w:t>• Producto del módulo 2, revisión comparada de una situación contractual y de jornada (evidencia AE2, 1 h): rúbrica analítica aplicada por el tutor, 8%.</w:t>
+        <w:t>• Producto del módulo 2, revisión guiada de una situación contractual y de jornada (evidencia AE2, 1 h): rúbrica analítica aplicada por el tutor, 8%.</w:t>
       </w:r>
     </w:p>
     <w:p>
@@ -2937,7 +2937,7 @@
         <w:rPr>
           <w:b w:val="0"/>
         </w:rPr>
-        <w:t>• Actualizar en Moodle los textos que citen los aprendizajes esperados antiguos (descripción del curso y de cada módulo, rúbricas de los productos, encabezados de evaluaciones) con los verbos nuevos: Examinar, Comparar, Diferenciar, Distinguir y Analizar.</w:t>
+        <w:t>• Actualizar en Moodle los textos que citen los aprendizajes esperados antiguos (descripción del curso y de cada módulo, rúbricas de los productos, encabezados de evaluaciones) con los nuevos objetos y contextos de cada aprendizaje esperado.</w:t>
       </w:r>
     </w:p>
     <w:p>

</xml_diff>

<commit_message>
Planilla SENCE: AE3 sube a nivel análisis (Diferenciar)
Co-Authored-By: Claude Opus 5.5 <noreply@anthropic.com>
Claude-Session: https://claude.ai/code/session_01YUXpBk1ah7fEtFeWJYkMKL
</commit_message>
<xml_diff>
--- a/sence/Legislacion_Laboral_Planilla_SENCE_reingreso.docx
+++ b/sence/Legislacion_Laboral_Planilla_SENCE_reingreso.docx
@@ -159,7 +159,7 @@
               <w:rPr>
                 <w:sz w:val="19"/>
               </w:rPr>
-              <w:t>Se mantiene el ascenso de Bloom hasta el verbo de la competencia: Identificar (conocimiento) → Describir y Explicar (comprensión) → Distinguir y Analizar (análisis). Cada AE ahora declara el mismo contexto laboral de la competencia (la gestión de personas) y una etapa del ciclo laboral. Cada producto de módulo aporta criterios que se integran en la auditoría final del caso integrador, que evidencia el análisis completo.</w:t>
+              <w:t>Se mantiene el ascenso de Bloom hasta el verbo de la competencia: Identificar (conocimiento) → Describir (comprensión) → Diferenciar, Distinguir y Analizar (análisis). Cada AE ahora declara el mismo contexto laboral de la competencia (la gestión de personas) y una etapa del ciclo laboral. Cada producto de módulo aporta criterios que se integran en la auditoría final del caso integrador, que evidencia el análisis completo.</w:t>
             </w:r>
           </w:p>
         </w:tc>
@@ -682,7 +682,7 @@
               <w:rPr>
                 <w:sz w:val="19"/>
               </w:rPr>
-              <w:t>Explicar derechos laborales en la tramitación de solicitudes del personal según el Código del Trabajo</w:t>
+              <w:t>Diferenciar derechos laborales en la tramitación de solicitudes del personal según el Código del Trabajo</w:t>
             </w:r>
           </w:p>
         </w:tc>
@@ -1853,7 +1853,7 @@
         <w:rPr>
           <w:b w:val="0"/>
         </w:rPr>
-        <w:t>AE3 – 12 h (Explicar derechos laborales en la tramitación de solicitudes del personal según el Código del Trabajo): explica derechos fundamentales, protección familiar, conciliación, feriado, permisos e inclusión en escenarios ramificados; resuelve con fundamentación una solicitud laboral.</w:t>
+        <w:t>AE3 – 12 h (Diferenciar derechos laborales en la tramitación de solicitudes del personal según el Código del Trabajo): diferencia derechos fundamentales, protección familiar, conciliación, feriado, permisos e inclusión en escenarios ramificados; resuelve con fundamentación una solicitud laboral.</w:t>
       </w:r>
     </w:p>
     <w:p>
@@ -1877,7 +1877,7 @@
         <w:rPr>
           <w:b w:val="0"/>
         </w:rPr>
-        <w:t>La secuencia asciende de conocimiento (AE1) a comprensión (AE2 y AE3) y análisis (AE4 y AE5); cada AE aborda una etapa de la relación laboral en el mismo contexto de gestión de personas y aporta los criterios que se integran en la auditoría final, que evidencia la competencia.</w:t>
+        <w:t>La secuencia asciende de conocimiento (AE1) a comprensión (AE2) y análisis (AE3 a AE5); cada AE aborda una etapa de la relación laboral en el mismo contexto de gestión de personas y aporta los criterios que se integran en la auditoría final, que evidencia la competencia.</w:t>
       </w:r>
     </w:p>
     <w:p>
@@ -2330,7 +2330,7 @@
         <w:rPr>
           <w:b w:val="0"/>
         </w:rPr>
-        <w:t>AE3: Explica derechos laborales en la tramitación de solicitudes del personal según el Código del Trabajo.</w:t>
+        <w:t>AE3: Diferencia derechos laborales en la tramitación de solicitudes del personal según el Código del Trabajo.</w:t>
       </w:r>
     </w:p>
     <w:p>

</xml_diff>